<commit_message>
Modifiche a procedura di migrazione
</commit_message>
<xml_diff>
--- a/docs/ProceduraDiMigrazione/Procedura_migrazione.docx
+++ b/docs/ProceduraDiMigrazione/Procedura_migrazione.docx
@@ -154,8 +154,36 @@
                                         <w:sz w:val="21"/>
                                         <w:szCs w:val="21"/>
                                       </w:rPr>
-                                      <w:t>Procedura per la gestione della migrazione una tantum e migrazione successiva dei clienti da Connexio a Gorico</w:t>
+                                      <w:t xml:space="preserve">Procedura per la gestione della migrazione una tantum e migrazione successiva dei clienti da </w:t>
                                     </w:r>
+                                    <w:proofErr w:type="spellStart"/>
+                                    <w:r>
+                                      <w:rPr>
+                                        <w:color w:val="FFFFFF" w:themeColor="background1"/>
+                                        <w:sz w:val="21"/>
+                                        <w:szCs w:val="21"/>
+                                      </w:rPr>
+                                      <w:t>Connexio</w:t>
+                                    </w:r>
+                                    <w:proofErr w:type="spellEnd"/>
+                                    <w:r>
+                                      <w:rPr>
+                                        <w:color w:val="FFFFFF" w:themeColor="background1"/>
+                                        <w:sz w:val="21"/>
+                                        <w:szCs w:val="21"/>
+                                      </w:rPr>
+                                      <w:t xml:space="preserve"> a </w:t>
+                                    </w:r>
+                                    <w:proofErr w:type="spellStart"/>
+                                    <w:r>
+                                      <w:rPr>
+                                        <w:color w:val="FFFFFF" w:themeColor="background1"/>
+                                        <w:sz w:val="21"/>
+                                        <w:szCs w:val="21"/>
+                                      </w:rPr>
+                                      <w:t>Gorico</w:t>
+                                    </w:r>
+                                    <w:proofErr w:type="spellEnd"/>
                                   </w:p>
                                 </w:sdtContent>
                               </w:sdt>
@@ -258,8 +286,36 @@
                                   <w:sz w:val="21"/>
                                   <w:szCs w:val="21"/>
                                 </w:rPr>
-                                <w:t>Procedura per la gestione della migrazione una tantum e migrazione successiva dei clienti da Connexio a Gorico</w:t>
+                                <w:t xml:space="preserve">Procedura per la gestione della migrazione una tantum e migrazione successiva dei clienti da </w:t>
                               </w:r>
+                              <w:proofErr w:type="spellStart"/>
+                              <w:r>
+                                <w:rPr>
+                                  <w:color w:val="FFFFFF" w:themeColor="background1"/>
+                                  <w:sz w:val="21"/>
+                                  <w:szCs w:val="21"/>
+                                </w:rPr>
+                                <w:t>Connexio</w:t>
+                              </w:r>
+                              <w:proofErr w:type="spellEnd"/>
+                              <w:r>
+                                <w:rPr>
+                                  <w:color w:val="FFFFFF" w:themeColor="background1"/>
+                                  <w:sz w:val="21"/>
+                                  <w:szCs w:val="21"/>
+                                </w:rPr>
+                                <w:t xml:space="preserve"> a </w:t>
+                              </w:r>
+                              <w:proofErr w:type="spellStart"/>
+                              <w:r>
+                                <w:rPr>
+                                  <w:color w:val="FFFFFF" w:themeColor="background1"/>
+                                  <w:sz w:val="21"/>
+                                  <w:szCs w:val="21"/>
+                                </w:rPr>
+                                <w:t>Gorico</w:t>
+                              </w:r>
+                              <w:proofErr w:type="spellEnd"/>
                             </w:p>
                           </w:sdtContent>
                         </w:sdt>
@@ -685,10 +741,26 @@
         <w:t xml:space="preserve">DB1: </w:t>
       </w:r>
       <w:r>
-        <w:t xml:space="preserve">Database di produzione 1 (cnx su Server OVH): contenente </w:t>
-      </w:r>
-      <w:r>
-        <w:t xml:space="preserve">le relative tabelle, sequenze, funzioni e view denominate rispettivamente </w:t>
+        <w:t>Database di produzione 1 (</w:t>
+      </w:r>
+      <w:proofErr w:type="spellStart"/>
+      <w:r>
+        <w:t>cnx</w:t>
+      </w:r>
+      <w:proofErr w:type="spellEnd"/>
+      <w:r>
+        <w:t xml:space="preserve"> su Server OVH): contenente </w:t>
+      </w:r>
+      <w:r>
+        <w:t xml:space="preserve">le relative tabelle, sequenze, funzioni e </w:t>
+      </w:r>
+      <w:proofErr w:type="spellStart"/>
+      <w:r>
+        <w:t>view</w:t>
+      </w:r>
+      <w:proofErr w:type="spellEnd"/>
+      <w:r>
+        <w:t xml:space="preserve"> denominate rispettivamente </w:t>
       </w:r>
       <w:r>
         <w:t xml:space="preserve">tabelle1, </w:t>
@@ -718,7 +790,15 @@
         <w:t xml:space="preserve">DB2: </w:t>
       </w:r>
       <w:r>
-        <w:t>Database di test 2 (Gorico su Server AWS)</w:t>
+        <w:t>Database di test 2 (</w:t>
+      </w:r>
+      <w:proofErr w:type="spellStart"/>
+      <w:r>
+        <w:t>Gorico</w:t>
+      </w:r>
+      <w:proofErr w:type="spellEnd"/>
+      <w:r>
+        <w:t xml:space="preserve"> su Server AWS)</w:t>
       </w:r>
       <w:r>
         <w:t>:</w:t>
@@ -727,7 +807,15 @@
         <w:t xml:space="preserve"> contenente </w:t>
       </w:r>
       <w:r>
-        <w:t>le relative tabelle, sequenze, funzioni e view denominate rispettivamente</w:t>
+        <w:t xml:space="preserve">le relative tabelle, sequenze, funzioni e </w:t>
+      </w:r>
+      <w:proofErr w:type="spellStart"/>
+      <w:r>
+        <w:t>view</w:t>
+      </w:r>
+      <w:proofErr w:type="spellEnd"/>
+      <w:r>
+        <w:t xml:space="preserve"> denominate rispettivamente</w:t>
       </w:r>
       <w:r>
         <w:t xml:space="preserve"> tabelle2, funzioni2, sequenze2 e view</w:t>
@@ -748,7 +836,21 @@
         </w:numPr>
       </w:pPr>
       <w:r>
-        <w:t>DB3: futuro database di produzione.</w:t>
+        <w:t>DB3</w:t>
+      </w:r>
+      <w:r>
+        <w:t xml:space="preserve"> (</w:t>
+      </w:r>
+      <w:proofErr w:type="spellStart"/>
+      <w:r>
+        <w:t>GoricoProd</w:t>
+      </w:r>
+      <w:proofErr w:type="spellEnd"/>
+      <w:r>
+        <w:t>)</w:t>
+      </w:r>
+      <w:r>
+        <w:t>: futuro database di produzione.</w:t>
       </w:r>
     </w:p>
     <w:p/>
@@ -788,16 +890,30 @@
         <w:t xml:space="preserve">Tale DB inizialmente dovrà contenere le </w:t>
       </w:r>
       <w:r>
-        <w:t>tabelle del database di produzione (tabelle1) e l’uni</w:t>
-      </w:r>
-      <w:r>
-        <w:t>one delle funzioni e delle view</w:t>
-      </w:r>
+        <w:t xml:space="preserve">tabelle </w:t>
+      </w:r>
+      <w:r>
+        <w:t xml:space="preserve">e i dati di DB1 </w:t>
+      </w:r>
+      <w:r>
+        <w:t>(tabelle1) e l’uni</w:t>
+      </w:r>
+      <w:r>
+        <w:t xml:space="preserve">one delle funzioni e delle </w:t>
+      </w:r>
+      <w:proofErr w:type="spellStart"/>
+      <w:r>
+        <w:t>view</w:t>
+      </w:r>
+      <w:proofErr w:type="spellEnd"/>
       <w:r>
         <w:t xml:space="preserve"> del database di produzione e di quello di test (funzioni1 U funzioni2 e views1 U views2).</w:t>
       </w:r>
       <w:r>
-        <w:t xml:space="preserve"> Successivamente si dovranno cancellare i dati delle aziende che si intende continuare a gestire su DB 1.</w:t>
+        <w:t xml:space="preserve"> Successivamente si dovranno cancellare i dati delle aziende che si intende continuare a gestire su DB 1</w:t>
+      </w:r>
+      <w:r>
+        <w:t xml:space="preserve"> e mantenere quelle che si intende gestire su DB3.</w:t>
       </w:r>
     </w:p>
     <w:p/>
@@ -819,8 +935,19 @@
           <w:szCs w:val="24"/>
         </w:rPr>
         <w:lastRenderedPageBreak/>
-        <w:t>Procedura per ottenere l’unione delle funzioni:</w:t>
-      </w:r>
+        <w:t xml:space="preserve">Caricare su AWS il DB </w:t>
+      </w:r>
+      <w:proofErr w:type="spellStart"/>
+      <w:r>
+        <w:rPr>
+          <w:b/>
+          <w:bCs/>
+          <w:sz w:val="24"/>
+          <w:szCs w:val="24"/>
+        </w:rPr>
+        <w:t>cnx</w:t>
+      </w:r>
+      <w:proofErr w:type="spellEnd"/>
     </w:p>
     <w:p>
       <w:pPr>
@@ -831,10 +958,15 @@
         </w:numPr>
       </w:pPr>
       <w:r>
-        <w:t>Usare la view grc_lista_funzioni per ottenere una lista delle funzioni presenti nel database1</w:t>
-      </w:r>
-      <w:r>
-        <w:t>.</w:t>
+        <w:t xml:space="preserve">Caricare su AWS il DB </w:t>
+      </w:r>
+      <w:proofErr w:type="spellStart"/>
+      <w:r>
+        <w:t>cnx</w:t>
+      </w:r>
+      <w:proofErr w:type="spellEnd"/>
+      <w:r>
+        <w:t xml:space="preserve"> backup di DB1;</w:t>
       </w:r>
     </w:p>
     <w:p>
@@ -846,11 +978,13 @@
         </w:numPr>
       </w:pPr>
       <w:r>
-        <w:t>Usare la view grc_lista_funzioni per ottenere una lista delle funzioni presenti nel database2</w:t>
-      </w:r>
-      <w:r>
-        <w:t>.</w:t>
-      </w:r>
+        <w:t xml:space="preserve">Dopo averlo caricato rinominare il nuovo DB </w:t>
+      </w:r>
+      <w:proofErr w:type="spellStart"/>
+      <w:r>
+        <w:t>GoricoProd</w:t>
+      </w:r>
+      <w:proofErr w:type="spellEnd"/>
     </w:p>
     <w:p>
       <w:pPr>
@@ -861,13 +995,50 @@
         </w:numPr>
       </w:pPr>
       <w:r>
-        <w:t xml:space="preserve"> Esportare in excel le due liste e tramite la funzione cerca.vert trovare quali funzioni sono presenti nel database1 ma non nel database2</w:t>
-      </w:r>
+        <w:t xml:space="preserve">Copiare </w:t>
+      </w:r>
+      <w:r>
+        <w:t xml:space="preserve">la </w:t>
+      </w:r>
+      <w:proofErr w:type="spellStart"/>
+      <w:r>
+        <w:t>view</w:t>
+      </w:r>
+      <w:proofErr w:type="spellEnd"/>
       <w:r>
         <w:t xml:space="preserve"> </w:t>
       </w:r>
       <w:r>
-        <w:t>(da sistemare: verificare se la procedura funziona correttamente)</w:t>
+        <w:t>“</w:t>
+      </w:r>
+      <w:proofErr w:type="spellStart"/>
+      <w:r>
+        <w:t>grc_lista_funzioni</w:t>
+      </w:r>
+      <w:proofErr w:type="spellEnd"/>
+      <w:r>
+        <w:t>”</w:t>
+      </w:r>
+      <w:r>
+        <w:t xml:space="preserve"> </w:t>
+      </w:r>
+      <w:r>
+        <w:t xml:space="preserve">(e query collegate … </w:t>
+      </w:r>
+      <w:r>
+        <w:rPr>
+          <w:highlight w:val="yellow"/>
+        </w:rPr>
+        <w:t>determinare quali sono</w:t>
+      </w:r>
+      <w:r>
+        <w:t xml:space="preserve">) su DB3 </w:t>
+      </w:r>
+      <w:r>
+        <w:t xml:space="preserve">per ottenere una lista delle funzioni presenti </w:t>
+      </w:r>
+      <w:r>
+        <w:t>in DB3</w:t>
       </w:r>
       <w:r>
         <w:t>.</w:t>
@@ -882,118 +1053,233 @@
         </w:numPr>
       </w:pPr>
       <w:r>
-        <w:t>nel database 3 di destinazione verranno importate tutte le funzioni del database2 ed in aggiunta quelle presenti nella lista ot</w:t>
-      </w:r>
-      <w:r>
-        <w:t>tenuta dall’operazione su excel.</w:t>
+        <w:t xml:space="preserve">Usare la </w:t>
+      </w:r>
+      <w:proofErr w:type="spellStart"/>
+      <w:r>
+        <w:t>view</w:t>
+      </w:r>
+      <w:proofErr w:type="spellEnd"/>
+      <w:r>
+        <w:t xml:space="preserve"> </w:t>
+      </w:r>
+      <w:proofErr w:type="spellStart"/>
+      <w:r>
+        <w:t>grc_lista_funzioni</w:t>
+      </w:r>
+      <w:proofErr w:type="spellEnd"/>
+      <w:r>
+        <w:t xml:space="preserve"> per ottenere una lista delle funzioni presenti nel database2.</w:t>
+      </w:r>
+    </w:p>
+    <w:p>
+      <w:pPr>
+        <w:pStyle w:val="Paragrafoelenco"/>
+        <w:numPr>
+          <w:ilvl w:val="0"/>
+          <w:numId w:val="2"/>
+        </w:numPr>
+      </w:pPr>
+      <w:r>
+        <w:t>Determinare quali funzioni mancano in DB3 (</w:t>
+      </w:r>
+      <w:r>
+        <w:rPr>
+          <w:highlight w:val="yellow"/>
+        </w:rPr>
+        <w:t>determinare e descrivere il procedimento … forse manca qualche funzione</w:t>
+      </w:r>
+      <w:r>
+        <w:t>)</w:t>
+      </w:r>
+      <w:r>
+        <w:t>.</w:t>
+      </w:r>
+      <w:r>
+        <w:t xml:space="preserve"> Si precisa che in caso delle funzioni esistano in entrambi i database dovranno prevalere quelle di DB2 rispetto a quelle di DB1 (</w:t>
+      </w:r>
+      <w:r>
+        <w:rPr>
+          <w:highlight w:val="yellow"/>
+        </w:rPr>
+        <w:t>ma prima confrontarsi con Amedeo</w:t>
+      </w:r>
+      <w:r>
+        <w:t>)</w:t>
+      </w:r>
+    </w:p>
+    <w:p>
+      <w:pPr>
+        <w:pStyle w:val="Paragrafoelenco"/>
+        <w:numPr>
+          <w:ilvl w:val="0"/>
+          <w:numId w:val="2"/>
+        </w:numPr>
+      </w:pPr>
+      <w:r>
+        <w:t>Dopo aver determinato quali funzioni mancano</w:t>
+      </w:r>
+      <w:r>
+        <w:t xml:space="preserve"> </w:t>
+      </w:r>
+      <w:r>
+        <w:t>utilizzare la</w:t>
+      </w:r>
+      <w:r>
+        <w:t xml:space="preserve"> funzione </w:t>
+      </w:r>
+      <w:proofErr w:type="spellStart"/>
+      <w:r>
+        <w:t>grc_lista_definizioni_</w:t>
+      </w:r>
+      <w:proofErr w:type="gramStart"/>
+      <w:r>
+        <w:t>funzioni</w:t>
+      </w:r>
+      <w:proofErr w:type="spellEnd"/>
+      <w:r>
+        <w:t>(</w:t>
+      </w:r>
+      <w:proofErr w:type="gramEnd"/>
+      <w:r>
+        <w:t>) che restituisce le de</w:t>
+      </w:r>
+      <w:r>
+        <w:t>finizioni di tutte le funzioni</w:t>
+      </w:r>
+      <w:r>
+        <w:t xml:space="preserve"> mancanti</w:t>
+      </w:r>
+      <w:r>
+        <w:t>.</w:t>
       </w:r>
     </w:p>
     <w:p/>
     <w:p>
       <w:pPr>
         <w:rPr>
-          <w:sz w:val="24"/>
-          <w:szCs w:val="24"/>
-        </w:rPr>
-      </w:pPr>
-      <w:r>
-        <w:rPr>
-          <w:sz w:val="24"/>
-          <w:szCs w:val="24"/>
-        </w:rPr>
-        <w:t xml:space="preserve">Per importare le funzioni è sufficiente: </w:t>
+          <w:b/>
+          <w:sz w:val="24"/>
+          <w:szCs w:val="24"/>
+        </w:rPr>
+      </w:pPr>
+      <w:r>
+        <w:rPr>
+          <w:b/>
+          <w:sz w:val="24"/>
+          <w:szCs w:val="24"/>
+        </w:rPr>
+        <w:t>Procedura p</w:t>
+      </w:r>
+      <w:r>
+        <w:rPr>
+          <w:b/>
+          <w:sz w:val="24"/>
+          <w:szCs w:val="24"/>
+        </w:rPr>
+        <w:t xml:space="preserve">er ottenere l’unione delle </w:t>
+      </w:r>
+      <w:proofErr w:type="spellStart"/>
+      <w:r>
+        <w:rPr>
+          <w:b/>
+          <w:sz w:val="24"/>
+          <w:szCs w:val="24"/>
+        </w:rPr>
+        <w:t>view</w:t>
+      </w:r>
+      <w:proofErr w:type="spellEnd"/>
+      <w:r>
+        <w:rPr>
+          <w:b/>
+          <w:sz w:val="24"/>
+          <w:szCs w:val="24"/>
+        </w:rPr>
+        <w:t>:</w:t>
       </w:r>
     </w:p>
     <w:p>
       <w:pPr>
-        <w:pStyle w:val="Paragrafoelenco"/>
-        <w:numPr>
-          <w:ilvl w:val="0"/>
-          <w:numId w:val="12"/>
-        </w:numPr>
-      </w:pPr>
-      <w:r>
-        <w:t>utilizzare la</w:t>
-      </w:r>
-      <w:r>
-        <w:t xml:space="preserve"> funzione grc_lista_definizioni_</w:t>
-      </w:r>
-      <w:r>
-        <w:t>funzioni() che restituisce le de</w:t>
-      </w:r>
-      <w:r>
-        <w:t>finizioni di tutte le funzioni.</w:t>
-      </w:r>
-    </w:p>
-    <w:p>
-      <w:pPr>
-        <w:pStyle w:val="Paragrafoelenco"/>
-        <w:numPr>
-          <w:ilvl w:val="0"/>
-          <w:numId w:val="12"/>
-        </w:numPr>
-      </w:pPr>
-      <w:r>
-        <w:t>cancellare le funzioni già prese</w:t>
-      </w:r>
-      <w:r>
-        <w:t>nti nel database 1 destinazione e poi incollare il testo</w:t>
-      </w:r>
-      <w:r>
-        <w:t xml:space="preserve"> nella finestra di script relativa al database di destinazione.</w:t>
-      </w:r>
-    </w:p>
-    <w:p>
-      <w:pPr>
-        <w:pStyle w:val="Paragrafoelenco"/>
-      </w:pPr>
-    </w:p>
-    <w:p>
-      <w:pPr>
-        <w:rPr>
-          <w:b/>
-          <w:sz w:val="24"/>
-          <w:szCs w:val="24"/>
-        </w:rPr>
-      </w:pPr>
-      <w:r>
-        <w:rPr>
-          <w:b/>
-          <w:sz w:val="24"/>
-          <w:szCs w:val="24"/>
-        </w:rPr>
-        <w:t>Procedura p</w:t>
-      </w:r>
-      <w:r>
-        <w:rPr>
-          <w:b/>
-          <w:sz w:val="24"/>
-          <w:szCs w:val="24"/>
-        </w:rPr>
-        <w:t>er ottenere l’unione delle view</w:t>
-      </w:r>
-      <w:r>
-        <w:rPr>
-          <w:b/>
-          <w:sz w:val="24"/>
-          <w:szCs w:val="24"/>
-        </w:rPr>
-        <w:t>:</w:t>
-      </w:r>
-    </w:p>
-    <w:p>
-      <w:pPr>
-        <w:rPr>
-          <w:sz w:val="24"/>
-          <w:szCs w:val="24"/>
-        </w:rPr>
-      </w:pPr>
-      <w:r>
-        <w:rPr>
-          <w:sz w:val="24"/>
-          <w:szCs w:val="24"/>
-        </w:rPr>
-        <w:t xml:space="preserve">si eseguono gli stessi passaggi effettuati per le funzioni utilizzando grc_lista_views e grc_lista_definizioni_views(). </w:t>
+        <w:rPr>
+          <w:sz w:val="24"/>
+          <w:szCs w:val="24"/>
+        </w:rPr>
+      </w:pPr>
+      <w:r>
+        <w:rPr>
+          <w:sz w:val="24"/>
+          <w:szCs w:val="24"/>
+        </w:rPr>
+        <w:t>S</w:t>
+      </w:r>
+      <w:r>
+        <w:rPr>
+          <w:sz w:val="24"/>
+          <w:szCs w:val="24"/>
+        </w:rPr>
+        <w:t xml:space="preserve">i eseguono gli stessi passaggi effettuati per le funzioni utilizzando </w:t>
+      </w:r>
+      <w:proofErr w:type="spellStart"/>
+      <w:r>
+        <w:rPr>
+          <w:sz w:val="24"/>
+          <w:szCs w:val="24"/>
+        </w:rPr>
+        <w:t>grc_lista_views</w:t>
+      </w:r>
+      <w:proofErr w:type="spellEnd"/>
+      <w:r>
+        <w:rPr>
+          <w:sz w:val="24"/>
+          <w:szCs w:val="24"/>
+        </w:rPr>
+        <w:t xml:space="preserve"> e </w:t>
+      </w:r>
+      <w:proofErr w:type="spellStart"/>
+      <w:r>
+        <w:rPr>
+          <w:sz w:val="24"/>
+          <w:szCs w:val="24"/>
+        </w:rPr>
+        <w:t>grc_lista_definizioni_</w:t>
+      </w:r>
+      <w:proofErr w:type="gramStart"/>
+      <w:r>
+        <w:rPr>
+          <w:sz w:val="24"/>
+          <w:szCs w:val="24"/>
+        </w:rPr>
+        <w:t>views</w:t>
+      </w:r>
+      <w:proofErr w:type="spellEnd"/>
+      <w:r>
+        <w:rPr>
+          <w:sz w:val="24"/>
+          <w:szCs w:val="24"/>
+        </w:rPr>
+        <w:t>(</w:t>
+      </w:r>
+      <w:proofErr w:type="gramEnd"/>
+      <w:r>
+        <w:rPr>
+          <w:sz w:val="24"/>
+          <w:szCs w:val="24"/>
+        </w:rPr>
+        <w:t>)</w:t>
+      </w:r>
+      <w:r>
+        <w:rPr>
+          <w:sz w:val="24"/>
+          <w:szCs w:val="24"/>
+        </w:rPr>
+        <w:t xml:space="preserve"> presenti su DB2</w:t>
+      </w:r>
+      <w:r>
+        <w:rPr>
+          <w:sz w:val="24"/>
+          <w:szCs w:val="24"/>
+        </w:rPr>
+        <w:t xml:space="preserve">. </w:t>
       </w:r>
     </w:p>
     <w:p/>
@@ -1034,7 +1320,15 @@
         </w:numPr>
       </w:pPr>
       <w:r>
-        <w:t>Esportare in csv record da DB1 riferiti all’azienda da migrare;</w:t>
+        <w:t xml:space="preserve">Esportare in </w:t>
+      </w:r>
+      <w:proofErr w:type="spellStart"/>
+      <w:r>
+        <w:t>csv</w:t>
+      </w:r>
+      <w:proofErr w:type="spellEnd"/>
+      <w:r>
+        <w:t xml:space="preserve"> record da DB1 riferiti all’azienda da migrare;</w:t>
       </w:r>
     </w:p>
     <w:p>
@@ -1046,19 +1340,15 @@
         </w:numPr>
       </w:pPr>
       <w:r>
-        <w:t>Cancellare eventuali record da DB3 riferiti all’azienda da migrare;</w:t>
-      </w:r>
-    </w:p>
-    <w:p>
-      <w:pPr>
-        <w:pStyle w:val="Paragrafoelenco"/>
-        <w:numPr>
-          <w:ilvl w:val="0"/>
-          <w:numId w:val="13"/>
-        </w:numPr>
-      </w:pPr>
-      <w:r>
-        <w:t>Importare dai file csv creati tramite la fase 1 gli eventuali files.</w:t>
+        <w:t xml:space="preserve">Importare dai file </w:t>
+      </w:r>
+      <w:proofErr w:type="spellStart"/>
+      <w:r>
+        <w:t>csv</w:t>
+      </w:r>
+      <w:proofErr w:type="spellEnd"/>
+      <w:r>
+        <w:t xml:space="preserve"> creati tramite la fase 1 gli eventuali files.</w:t>
       </w:r>
     </w:p>
     <w:p>
@@ -1084,7 +1374,35 @@
         <w:rPr>
           <w:b/>
         </w:rPr>
-        <w:t>Esportare in csv i recorda da DB1</w:t>
+        <w:t xml:space="preserve">Esportare in </w:t>
+      </w:r>
+      <w:proofErr w:type="spellStart"/>
+      <w:r>
+        <w:rPr>
+          <w:b/>
+        </w:rPr>
+        <w:t>csv</w:t>
+      </w:r>
+      <w:proofErr w:type="spellEnd"/>
+      <w:r>
+        <w:rPr>
+          <w:b/>
+        </w:rPr>
+        <w:t xml:space="preserve"> i </w:t>
+      </w:r>
+      <w:proofErr w:type="spellStart"/>
+      <w:r>
+        <w:rPr>
+          <w:b/>
+        </w:rPr>
+        <w:t>recorda</w:t>
+      </w:r>
+      <w:proofErr w:type="spellEnd"/>
+      <w:r>
+        <w:rPr>
+          <w:b/>
+        </w:rPr>
+        <w:t xml:space="preserve"> da DB1</w:t>
       </w:r>
     </w:p>
     <w:p>
@@ -1120,7 +1438,39 @@
           <w:sz w:val="24"/>
           <w:szCs w:val="24"/>
         </w:rPr>
-        <w:t>la funzione grc_esporta_tabelle(‘codice azienda’, ‘codice partizione’).</w:t>
+        <w:t xml:space="preserve">la funzione </w:t>
+      </w:r>
+      <w:proofErr w:type="spellStart"/>
+      <w:r>
+        <w:rPr>
+          <w:sz w:val="24"/>
+          <w:szCs w:val="24"/>
+        </w:rPr>
+        <w:t>grc_esporta_</w:t>
+      </w:r>
+      <w:proofErr w:type="gramStart"/>
+      <w:r>
+        <w:rPr>
+          <w:sz w:val="24"/>
+          <w:szCs w:val="24"/>
+        </w:rPr>
+        <w:t>tabelle</w:t>
+      </w:r>
+      <w:proofErr w:type="spellEnd"/>
+      <w:r>
+        <w:rPr>
+          <w:sz w:val="24"/>
+          <w:szCs w:val="24"/>
+        </w:rPr>
+        <w:t>(</w:t>
+      </w:r>
+      <w:proofErr w:type="gramEnd"/>
+      <w:r>
+        <w:rPr>
+          <w:sz w:val="24"/>
+          <w:szCs w:val="24"/>
+        </w:rPr>
+        <w:t>‘codice azienda’, ‘codice partizione’).</w:t>
       </w:r>
     </w:p>
     <w:p>
@@ -1173,7 +1523,39 @@
         <w:rPr>
           <w:b/>
         </w:rPr>
-        <w:t>Cancellare eventuali record relativi a quell’azienda già presenti in DB3</w:t>
+        <w:t>Impo</w:t>
+      </w:r>
+      <w:r>
+        <w:rPr>
+          <w:b/>
+        </w:rPr>
+        <w:t>r</w:t>
+      </w:r>
+      <w:r>
+        <w:rPr>
+          <w:b/>
+        </w:rPr>
+        <w:t xml:space="preserve">tare record dai file </w:t>
+      </w:r>
+      <w:proofErr w:type="spellStart"/>
+      <w:r>
+        <w:rPr>
+          <w:b/>
+        </w:rPr>
+        <w:t>csv</w:t>
+      </w:r>
+      <w:proofErr w:type="spellEnd"/>
+      <w:r>
+        <w:rPr>
+          <w:b/>
+        </w:rPr>
+        <w:t xml:space="preserve"> creati tramite fase 1</w:t>
+      </w:r>
+      <w:r>
+        <w:rPr>
+          <w:b/>
+        </w:rPr>
+        <w:t>:</w:t>
       </w:r>
     </w:p>
     <w:p>
@@ -1187,67 +1569,6 @@
         <w:rPr>
           <w:sz w:val="24"/>
           <w:szCs w:val="24"/>
-          <w:highlight w:val="yellow"/>
-        </w:rPr>
-        <w:t>Funzione ancora da creare.</w:t>
-      </w:r>
-    </w:p>
-    <w:p>
-      <w:pPr>
-        <w:rPr>
-          <w:b/>
-          <w:sz w:val="24"/>
-          <w:szCs w:val="24"/>
-        </w:rPr>
-      </w:pPr>
-    </w:p>
-    <w:p>
-      <w:pPr>
-        <w:pStyle w:val="Paragrafoelenco"/>
-        <w:numPr>
-          <w:ilvl w:val="6"/>
-          <w:numId w:val="2"/>
-        </w:numPr>
-        <w:rPr>
-          <w:b/>
-        </w:rPr>
-      </w:pPr>
-      <w:r>
-        <w:rPr>
-          <w:b/>
-        </w:rPr>
-        <w:t>Impo</w:t>
-      </w:r>
-      <w:r>
-        <w:rPr>
-          <w:b/>
-        </w:rPr>
-        <w:t>r</w:t>
-      </w:r>
-      <w:r>
-        <w:rPr>
-          <w:b/>
-        </w:rPr>
-        <w:t>tare record dai file csv creati tramite fase 1</w:t>
-      </w:r>
-      <w:r>
-        <w:rPr>
-          <w:b/>
-        </w:rPr>
-        <w:t>:</w:t>
-      </w:r>
-    </w:p>
-    <w:p>
-      <w:pPr>
-        <w:rPr>
-          <w:sz w:val="24"/>
-          <w:szCs w:val="24"/>
-        </w:rPr>
-      </w:pPr>
-      <w:r>
-        <w:rPr>
-          <w:sz w:val="24"/>
-          <w:szCs w:val="24"/>
         </w:rPr>
         <w:t>I</w:t>
       </w:r>
@@ -1270,22 +1591,78 @@
           <w:sz w:val="24"/>
           <w:szCs w:val="24"/>
         </w:rPr>
-        <w:t>un formato csv in un  database si utilizza la funzione grc_importa_tabelle(‘nome azienda’).</w:t>
-      </w:r>
-    </w:p>
-    <w:p>
-      <w:pPr>
-        <w:rPr>
-          <w:sz w:val="24"/>
-          <w:szCs w:val="24"/>
-        </w:rPr>
-      </w:pPr>
-      <w:r>
-        <w:rPr>
-          <w:sz w:val="24"/>
-          <w:szCs w:val="24"/>
-        </w:rPr>
-        <w:t>(da sistemare: tutto il codice)</w:t>
+        <w:t xml:space="preserve">un formato </w:t>
+      </w:r>
+      <w:proofErr w:type="spellStart"/>
+      <w:r>
+        <w:rPr>
+          <w:sz w:val="24"/>
+          <w:szCs w:val="24"/>
+        </w:rPr>
+        <w:t>csv</w:t>
+      </w:r>
+      <w:proofErr w:type="spellEnd"/>
+      <w:r>
+        <w:rPr>
+          <w:sz w:val="24"/>
+          <w:szCs w:val="24"/>
+        </w:rPr>
+        <w:t xml:space="preserve"> in </w:t>
+      </w:r>
+      <w:proofErr w:type="gramStart"/>
+      <w:r>
+        <w:rPr>
+          <w:sz w:val="24"/>
+          <w:szCs w:val="24"/>
+        </w:rPr>
+        <w:t>un  database</w:t>
+      </w:r>
+      <w:proofErr w:type="gramEnd"/>
+      <w:r>
+        <w:rPr>
+          <w:sz w:val="24"/>
+          <w:szCs w:val="24"/>
+        </w:rPr>
+        <w:t xml:space="preserve"> si utilizza la funzione </w:t>
+      </w:r>
+      <w:proofErr w:type="spellStart"/>
+      <w:r>
+        <w:rPr>
+          <w:sz w:val="24"/>
+          <w:szCs w:val="24"/>
+        </w:rPr>
+        <w:t>grc_importa_tabelle</w:t>
+      </w:r>
+      <w:proofErr w:type="spellEnd"/>
+      <w:r>
+        <w:rPr>
+          <w:sz w:val="24"/>
+          <w:szCs w:val="24"/>
+        </w:rPr>
+        <w:t>(‘nome azienda’).</w:t>
+      </w:r>
+      <w:r>
+        <w:rPr>
+          <w:sz w:val="24"/>
+          <w:szCs w:val="24"/>
+        </w:rPr>
+        <w:t xml:space="preserve"> Si precisa che la funziona </w:t>
+      </w:r>
+      <w:proofErr w:type="spellStart"/>
+      <w:r>
+        <w:rPr>
+          <w:sz w:val="24"/>
+          <w:szCs w:val="24"/>
+        </w:rPr>
+        <w:t>grc_importa_tabelle</w:t>
+      </w:r>
+      <w:proofErr w:type="spellEnd"/>
+      <w:r>
+        <w:rPr>
+          <w:sz w:val="24"/>
+          <w:szCs w:val="24"/>
+        </w:rPr>
+        <w:t xml:space="preserve"> include al suo interno una routine che cancella preventivamente i record relativi alla Società da importare.</w:t>
       </w:r>
     </w:p>
     <w:p/>
@@ -1313,8 +1690,25 @@
           <w:sz w:val="24"/>
           <w:szCs w:val="24"/>
         </w:rPr>
-        <w:t xml:space="preserve">Di seguito le tabelle, sequenze, view, funzioni preliminari per </w:t>
-      </w:r>
+        <w:t xml:space="preserve">Di seguito le tabelle, sequenze, </w:t>
+      </w:r>
+      <w:proofErr w:type="spellStart"/>
+      <w:r>
+        <w:rPr>
+          <w:sz w:val="24"/>
+          <w:szCs w:val="24"/>
+        </w:rPr>
+        <w:t>view</w:t>
+      </w:r>
+      <w:proofErr w:type="spellEnd"/>
+      <w:r>
+        <w:rPr>
+          <w:sz w:val="24"/>
+          <w:szCs w:val="24"/>
+        </w:rPr>
+        <w:t xml:space="preserve">, funzioni preliminari per </w:t>
+      </w:r>
+      <w:proofErr w:type="gramStart"/>
       <w:r>
         <w:rPr>
           <w:sz w:val="24"/>
@@ -1329,6 +1723,7 @@
         </w:rPr>
         <w:t>importazione</w:t>
       </w:r>
+      <w:proofErr w:type="gramEnd"/>
       <w:r>
         <w:rPr>
           <w:sz w:val="24"/>
@@ -1525,8 +1920,13 @@
             <w:tcW w:w="3802" w:type="dxa"/>
           </w:tcPr>
           <w:p>
+            <w:proofErr w:type="spellStart"/>
             <w:r>
-              <w:t>grc_tabella_ca_cp_nulla(text)</w:t>
+              <w:t>grc_tabella_ca_cp_nulla</w:t>
+            </w:r>
+            <w:proofErr w:type="spellEnd"/>
+            <w:r>
+              <w:t>(text)</w:t>
             </w:r>
           </w:p>
         </w:tc>
@@ -1557,9 +1957,11 @@
             <w:tcW w:w="3802" w:type="dxa"/>
           </w:tcPr>
           <w:p>
+            <w:proofErr w:type="spellStart"/>
             <w:r>
               <w:t>entrasp.grc_esporta_tabelle</w:t>
             </w:r>
+            <w:proofErr w:type="spellEnd"/>
           </w:p>
         </w:tc>
         <w:tc>
@@ -1589,9 +1991,11 @@
             <w:tcW w:w="3802" w:type="dxa"/>
           </w:tcPr>
           <w:p>
+            <w:proofErr w:type="spellStart"/>
             <w:r>
               <w:t>grc_importa_tabelle</w:t>
             </w:r>
+            <w:proofErr w:type="spellEnd"/>
           </w:p>
         </w:tc>
         <w:tc>
@@ -1621,9 +2025,11 @@
             <w:tcW w:w="3802" w:type="dxa"/>
           </w:tcPr>
           <w:p>
+            <w:proofErr w:type="spellStart"/>
             <w:r>
               <w:t>entrasp.grc_listacampiditabella</w:t>
             </w:r>
+            <w:proofErr w:type="spellEnd"/>
           </w:p>
         </w:tc>
         <w:tc>
@@ -1653,9 +2059,11 @@
             <w:tcW w:w="3802" w:type="dxa"/>
           </w:tcPr>
           <w:p>
+            <w:proofErr w:type="spellStart"/>
             <w:r>
               <w:t>entrasp.grc_listacampiditabella_non_pk</w:t>
             </w:r>
+            <w:proofErr w:type="spellEnd"/>
           </w:p>
         </w:tc>
         <w:tc>
@@ -1685,9 +2093,11 @@
             <w:tcW w:w="3802" w:type="dxa"/>
           </w:tcPr>
           <w:p>
+            <w:proofErr w:type="spellStart"/>
             <w:r>
               <w:t>entrasp.grc_listacampiditabella_pk</w:t>
             </w:r>
+            <w:proofErr w:type="spellEnd"/>
           </w:p>
         </w:tc>
         <w:tc>
@@ -1717,9 +2127,11 @@
             <w:tcW w:w="3802" w:type="dxa"/>
           </w:tcPr>
           <w:p>
+            <w:proofErr w:type="spellStart"/>
             <w:r>
               <w:t>grc_tabelle</w:t>
             </w:r>
+            <w:proofErr w:type="spellEnd"/>
           </w:p>
         </w:tc>
         <w:tc>
@@ -1727,9 +2139,11 @@
             <w:tcW w:w="1113" w:type="dxa"/>
           </w:tcPr>
           <w:p>
+            <w:proofErr w:type="spellStart"/>
             <w:r>
               <w:t>View</w:t>
             </w:r>
+            <w:proofErr w:type="spellEnd"/>
           </w:p>
         </w:tc>
         <w:tc>
@@ -1749,9 +2163,11 @@
             <w:tcW w:w="3802" w:type="dxa"/>
           </w:tcPr>
           <w:p>
+            <w:proofErr w:type="spellStart"/>
             <w:r>
               <w:t>grc_tabelle_ca_cp</w:t>
             </w:r>
+            <w:proofErr w:type="spellEnd"/>
           </w:p>
         </w:tc>
         <w:tc>
@@ -1759,9 +2175,11 @@
             <w:tcW w:w="1113" w:type="dxa"/>
           </w:tcPr>
           <w:p>
+            <w:proofErr w:type="spellStart"/>
             <w:r>
               <w:t>View</w:t>
             </w:r>
+            <w:proofErr w:type="spellEnd"/>
           </w:p>
         </w:tc>
         <w:tc>
@@ -1772,8 +2190,6 @@
             <w:r>
               <w:t>01-funzioni_view_sequenze_import_export_aziende</w:t>
             </w:r>
-            <w:bookmarkStart w:id="1" w:name="_GoBack"/>
-            <w:bookmarkEnd w:id="1"/>
           </w:p>
         </w:tc>
       </w:tr>
@@ -1786,12 +2202,30 @@
           <w:szCs w:val="24"/>
         </w:rPr>
       </w:pPr>
-      <w:r>
-        <w:rPr>
-          <w:sz w:val="24"/>
-          <w:szCs w:val="24"/>
-        </w:rPr>
-        <w:t>E’ altresì necessario importare i valori della tabella denominata “Tabelle” tramite il file denominato “tabelle.csv”</w:t>
+      <w:proofErr w:type="gramStart"/>
+      <w:r>
+        <w:rPr>
+          <w:sz w:val="24"/>
+          <w:szCs w:val="24"/>
+        </w:rPr>
+        <w:t>E’</w:t>
+      </w:r>
+      <w:proofErr w:type="gramEnd"/>
+      <w:r>
+        <w:rPr>
+          <w:sz w:val="24"/>
+          <w:szCs w:val="24"/>
+        </w:rPr>
+        <w:t xml:space="preserve"> altresì necessario importare i valori della tabella denominata “Tabelle” tramite il file d</w:t>
+      </w:r>
+      <w:bookmarkStart w:id="1" w:name="_GoBack"/>
+      <w:bookmarkEnd w:id="1"/>
+      <w:r>
+        <w:rPr>
+          <w:sz w:val="24"/>
+          <w:szCs w:val="24"/>
+        </w:rPr>
+        <w:t>enominato “tabelle.csv”</w:t>
       </w:r>
       <w:r>
         <w:rPr>
@@ -3631,6 +4065,36 @@
       <w:lang w:eastAsia="it-IT"/>
     </w:rPr>
   </w:style>
+  <w:style w:type="paragraph" w:styleId="Testofumetto">
+    <w:name w:val="Balloon Text"/>
+    <w:basedOn w:val="Normale"/>
+    <w:link w:val="TestofumettoCarattere"/>
+    <w:uiPriority w:val="99"/>
+    <w:semiHidden/>
+    <w:unhideWhenUsed/>
+    <w:rsid w:val="00B67C90"/>
+    <w:pPr>
+      <w:spacing w:after="0" w:line="240" w:lineRule="auto"/>
+    </w:pPr>
+    <w:rPr>
+      <w:rFonts w:ascii="Segoe UI" w:hAnsi="Segoe UI" w:cs="Segoe UI"/>
+      <w:sz w:val="18"/>
+      <w:szCs w:val="18"/>
+    </w:rPr>
+  </w:style>
+  <w:style w:type="character" w:customStyle="1" w:styleId="TestofumettoCarattere">
+    <w:name w:val="Testo fumetto Carattere"/>
+    <w:basedOn w:val="Carpredefinitoparagrafo"/>
+    <w:link w:val="Testofumetto"/>
+    <w:uiPriority w:val="99"/>
+    <w:semiHidden/>
+    <w:rsid w:val="00B67C90"/>
+    <w:rPr>
+      <w:rFonts w:ascii="Segoe UI" w:hAnsi="Segoe UI" w:cs="Segoe UI"/>
+      <w:sz w:val="18"/>
+      <w:szCs w:val="18"/>
+    </w:rPr>
+  </w:style>
 </w:styles>
 </file>
 

</xml_diff>

<commit_message>
Ulteriore perfezionamento procedura di migrazione
</commit_message>
<xml_diff>
--- a/docs/ProceduraDiMigrazione/Procedura_migrazione.docx
+++ b/docs/ProceduraDiMigrazione/Procedura_migrazione.docx
@@ -966,7 +966,129 @@
       </w:r>
       <w:proofErr w:type="spellEnd"/>
       <w:r>
-        <w:t xml:space="preserve"> backup di DB1;</w:t>
+        <w:t xml:space="preserve"> backup di DB1</w:t>
+      </w:r>
+      <w:r>
+        <w:t xml:space="preserve">: per farlo è necessario usare </w:t>
+      </w:r>
+      <w:proofErr w:type="spellStart"/>
+      <w:r>
+        <w:t>scp</w:t>
+      </w:r>
+      <w:proofErr w:type="spellEnd"/>
+      <w:r>
+        <w:t xml:space="preserve"> (da GIT </w:t>
+      </w:r>
+      <w:proofErr w:type="spellStart"/>
+      <w:r>
+        <w:t>Bash</w:t>
+      </w:r>
+      <w:proofErr w:type="spellEnd"/>
+      <w:r>
+        <w:t>)</w:t>
+      </w:r>
+      <w:r>
+        <w:t>:</w:t>
+      </w:r>
+    </w:p>
+    <w:p>
+      <w:pPr>
+        <w:pStyle w:val="Paragrafoelenco"/>
+        <w:numPr>
+          <w:ilvl w:val="1"/>
+          <w:numId w:val="2"/>
+        </w:numPr>
+      </w:pPr>
+      <w:r>
+        <w:t xml:space="preserve">Andare nella dir in cui c’è il </w:t>
+      </w:r>
+      <w:proofErr w:type="spellStart"/>
+      <w:r>
+        <w:t>db</w:t>
+      </w:r>
+      <w:proofErr w:type="spellEnd"/>
+      <w:r>
+        <w:t>;</w:t>
+      </w:r>
+    </w:p>
+    <w:p>
+      <w:pPr>
+        <w:pStyle w:val="Paragrafoelenco"/>
+        <w:numPr>
+          <w:ilvl w:val="1"/>
+          <w:numId w:val="2"/>
+        </w:numPr>
+      </w:pPr>
+      <w:r>
+        <w:t>Scrivere il comando (opportunam</w:t>
+      </w:r>
+      <w:r>
+        <w:t xml:space="preserve">ente modificato in relazione al nome del </w:t>
+      </w:r>
+      <w:proofErr w:type="spellStart"/>
+      <w:r>
+        <w:t>db</w:t>
+      </w:r>
+      <w:proofErr w:type="spellEnd"/>
+      <w:r>
+        <w:t xml:space="preserve"> ed alla posizione della chiave di autenticazione (</w:t>
+      </w:r>
+      <w:proofErr w:type="gramStart"/>
+      <w:r>
+        <w:t>file .</w:t>
+      </w:r>
+      <w:proofErr w:type="spellStart"/>
+      <w:r>
+        <w:t>pem</w:t>
+      </w:r>
+      <w:proofErr w:type="spellEnd"/>
+      <w:proofErr w:type="gramEnd"/>
+      <w:r>
+        <w:t>):</w:t>
+      </w:r>
+    </w:p>
+    <w:p>
+      <w:pPr>
+        <w:autoSpaceDE w:val="0"/>
+        <w:autoSpaceDN w:val="0"/>
+        <w:adjustRightInd w:val="0"/>
+        <w:spacing w:after="0" w:line="276" w:lineRule="auto"/>
+        <w:rPr>
+          <w:rFonts w:ascii="Lucida Console" w:hAnsi="Lucida Console" w:cs="Lucida Console"/>
+          <w:lang w:val="en-GB"/>
+        </w:rPr>
+      </w:pPr>
+      <w:proofErr w:type="spellStart"/>
+      <w:r>
+        <w:rPr>
+          <w:rFonts w:ascii="Lucida Console" w:hAnsi="Lucida Console" w:cs="Lucida Console"/>
+          <w:lang w:val="en-GB"/>
+        </w:rPr>
+        <w:t>scp</w:t>
+      </w:r>
+      <w:proofErr w:type="spellEnd"/>
+      <w:r>
+        <w:rPr>
+          <w:rFonts w:ascii="Lucida Console" w:hAnsi="Lucida Console" w:cs="Lucida Console"/>
+          <w:lang w:val="en-GB"/>
+        </w:rPr>
+        <w:t xml:space="preserve"> -</w:t>
+      </w:r>
+      <w:proofErr w:type="spellStart"/>
+      <w:r>
+        <w:rPr>
+          <w:rFonts w:ascii="Lucida Console" w:hAnsi="Lucida Console" w:cs="Lucida Console"/>
+          <w:lang w:val="en-GB"/>
+        </w:rPr>
+        <w:t>i</w:t>
+      </w:r>
+      <w:proofErr w:type="spellEnd"/>
+      <w:r>
+        <w:rPr>
+          <w:rFonts w:ascii="Lucida Console" w:hAnsi="Lucida Console" w:cs="Lucida Console"/>
+          <w:lang w:val="en-GB"/>
+        </w:rPr>
+        <w:t xml:space="preserve"> C:/Users/Amedeo/OneDrive/MigrazioneGRC_One_Drive/keys/server_amedeo.pem ./cnx_db_2020-02-16_00-03.backup ec2-user@18.197.167.37:/home/ec2-user/</w:t>
       </w:r>
     </w:p>
     <w:p>
@@ -977,14 +1099,60 @@
           <w:numId w:val="2"/>
         </w:numPr>
       </w:pPr>
-      <w:r>
-        <w:t xml:space="preserve">Dopo averlo caricato rinominare il nuovo DB </w:t>
+      <w:bookmarkStart w:id="1" w:name="_GoBack"/>
+      <w:bookmarkEnd w:id="1"/>
+      <w:r>
+        <w:t xml:space="preserve">Caricare istanza del </w:t>
       </w:r>
       <w:proofErr w:type="spellStart"/>
       <w:r>
-        <w:t>GoricoProd</w:t>
+        <w:t>db</w:t>
       </w:r>
       <w:proofErr w:type="spellEnd"/>
+      <w:r>
+        <w:t xml:space="preserve"> tramite comando dalla shell di </w:t>
+      </w:r>
+      <w:proofErr w:type="spellStart"/>
+      <w:r>
+        <w:t>ssh</w:t>
+      </w:r>
+      <w:proofErr w:type="spellEnd"/>
+      <w:r>
+        <w:t>:</w:t>
+      </w:r>
+    </w:p>
+    <w:p>
+      <w:pPr>
+        <w:pStyle w:val="Paragrafoelenco"/>
+        <w:ind w:left="360"/>
+      </w:pPr>
+      <w:proofErr w:type="spellStart"/>
+      <w:r>
+        <w:t>pg_restore</w:t>
+      </w:r>
+      <w:proofErr w:type="spellEnd"/>
+      <w:r>
+        <w:t xml:space="preserve"> -v -h goricotest-new.caxbbckt9xen.eu-central-1.rds.amazonaws.com -U </w:t>
+      </w:r>
+      <w:proofErr w:type="spellStart"/>
+      <w:r>
+        <w:t>postgres</w:t>
+      </w:r>
+      <w:proofErr w:type="spellEnd"/>
+      <w:r>
+        <w:t xml:space="preserve"> -d </w:t>
+      </w:r>
+      <w:proofErr w:type="spellStart"/>
+      <w:r>
+        <w:t>Gorico</w:t>
+      </w:r>
+      <w:r>
+        <w:t>Prod</w:t>
+      </w:r>
+      <w:proofErr w:type="spellEnd"/>
+      <w:r>
+        <w:t xml:space="preserve"> Backup20190902</w:t>
+      </w:r>
     </w:p>
     <w:p>
       <w:pPr>
@@ -995,10 +1163,7 @@
         </w:numPr>
       </w:pPr>
       <w:r>
-        <w:t xml:space="preserve">Copiare </w:t>
-      </w:r>
-      <w:r>
-        <w:t xml:space="preserve">la </w:t>
+        <w:t xml:space="preserve">Copiare la </w:t>
       </w:r>
       <w:proofErr w:type="spellStart"/>
       <w:r>
@@ -1006,10 +1171,7 @@
       </w:r>
       <w:proofErr w:type="spellEnd"/>
       <w:r>
-        <w:t xml:space="preserve"> </w:t>
-      </w:r>
-      <w:r>
-        <w:t>“</w:t>
+        <w:t xml:space="preserve"> “</w:t>
       </w:r>
       <w:proofErr w:type="spellStart"/>
       <w:r>
@@ -1017,13 +1179,7 @@
       </w:r>
       <w:proofErr w:type="spellEnd"/>
       <w:r>
-        <w:t>”</w:t>
-      </w:r>
-      <w:r>
-        <w:t xml:space="preserve"> </w:t>
-      </w:r>
-      <w:r>
-        <w:t xml:space="preserve">(e query collegate … </w:t>
+        <w:t xml:space="preserve">” (e query collegate … </w:t>
       </w:r>
       <w:r>
         <w:rPr>
@@ -1032,16 +1188,7 @@
         <w:t>determinare quali sono</w:t>
       </w:r>
       <w:r>
-        <w:t xml:space="preserve">) su DB3 </w:t>
-      </w:r>
-      <w:r>
-        <w:t xml:space="preserve">per ottenere una lista delle funzioni presenti </w:t>
-      </w:r>
-      <w:r>
-        <w:t>in DB3</w:t>
-      </w:r>
-      <w:r>
-        <w:t>.</w:t>
+        <w:t>) su DB3 per ottenere una lista delle funzioni presenti in DB3.</w:t>
       </w:r>
     </w:p>
     <w:p>
@@ -1090,13 +1237,7 @@
         <w:t>determinare e descrivere il procedimento … forse manca qualche funzione</w:t>
       </w:r>
       <w:r>
-        <w:t>)</w:t>
-      </w:r>
-      <w:r>
-        <w:t>.</w:t>
-      </w:r>
-      <w:r>
-        <w:t xml:space="preserve"> Si precisa che in caso delle funzioni esistano in entrambi i database dovranno prevalere quelle di DB2 rispetto a quelle di DB1 (</w:t>
+        <w:t>). Si precisa che in caso delle funzioni esistano in entrambi i database dovranno prevalere quelle di DB2 rispetto a quelle di DB1 (</w:t>
       </w:r>
       <w:r>
         <w:rPr>
@@ -1607,7 +1748,15 @@
           <w:sz w:val="24"/>
           <w:szCs w:val="24"/>
         </w:rPr>
-        <w:t xml:space="preserve"> in </w:t>
+        <w:t xml:space="preserve"> in un database si utilizza la funzione </w:t>
+      </w:r>
+      <w:proofErr w:type="spellStart"/>
+      <w:r>
+        <w:rPr>
+          <w:sz w:val="24"/>
+          <w:szCs w:val="24"/>
+        </w:rPr>
+        <w:t>grc_importa_</w:t>
       </w:r>
       <w:proofErr w:type="gramStart"/>
       <w:r>
@@ -1615,7 +1764,15 @@
           <w:sz w:val="24"/>
           <w:szCs w:val="24"/>
         </w:rPr>
-        <w:t>un  database</w:t>
+        <w:t>tabelle</w:t>
+      </w:r>
+      <w:proofErr w:type="spellEnd"/>
+      <w:r>
+        <w:rPr>
+          <w:sz w:val="24"/>
+          <w:szCs w:val="24"/>
+        </w:rPr>
+        <w:t>(</w:t>
       </w:r>
       <w:proofErr w:type="gramEnd"/>
       <w:r>
@@ -1623,23 +1780,7 @@
           <w:sz w:val="24"/>
           <w:szCs w:val="24"/>
         </w:rPr>
-        <w:t xml:space="preserve"> si utilizza la funzione </w:t>
-      </w:r>
-      <w:proofErr w:type="spellStart"/>
-      <w:r>
-        <w:rPr>
-          <w:sz w:val="24"/>
-          <w:szCs w:val="24"/>
-        </w:rPr>
-        <w:t>grc_importa_tabelle</w:t>
-      </w:r>
-      <w:proofErr w:type="spellEnd"/>
-      <w:r>
-        <w:rPr>
-          <w:sz w:val="24"/>
-          <w:szCs w:val="24"/>
-        </w:rPr>
-        <w:t>(‘nome azienda’).</w:t>
+        <w:t>‘nome azienda’).</w:t>
       </w:r>
       <w:r>
         <w:rPr>
@@ -1675,6 +1816,7 @@
         </w:numPr>
       </w:pPr>
       <w:r>
+        <w:lastRenderedPageBreak/>
         <w:t>Attività preliminari</w:t>
       </w:r>
     </w:p>
@@ -2216,16 +2358,7 @@
           <w:sz w:val="24"/>
           <w:szCs w:val="24"/>
         </w:rPr>
-        <w:t xml:space="preserve"> altresì necessario importare i valori della tabella denominata “Tabelle” tramite il file d</w:t>
-      </w:r>
-      <w:bookmarkStart w:id="1" w:name="_GoBack"/>
-      <w:bookmarkEnd w:id="1"/>
-      <w:r>
-        <w:rPr>
-          <w:sz w:val="24"/>
-          <w:szCs w:val="24"/>
-        </w:rPr>
-        <w:t>enominato “tabelle.csv”</w:t>
+        <w:t xml:space="preserve"> altresì necessario importare i valori della tabella denominata “Tabelle” tramite il file denominato “tabelle.csv”</w:t>
       </w:r>
       <w:r>
         <w:rPr>

</xml_diff>